<commit_message>
Week 1: update lecture notes, Lab01, and HW01 on Jul 17 2026
</commit_message>
<xml_diff>
--- a/homework/hw01/HW01_Assignment.docx
+++ b/homework/hw01/HW01_Assignment.docx
@@ -301,7 +301,7 @@
           <w:sz w:val="22"/>
           <w:szCs w:val="22"/>
         </w:rPr>
-        <w:t xml:space="preserve">You will need your completed </w:t>
+        <w:t xml:space="preserve">The completed </w:t>
       </w:r>
       <w:r>
         <w:rPr>
@@ -321,7 +321,7 @@
           <w:sz w:val="22"/>
           <w:szCs w:val="22"/>
         </w:rPr>
-        <w:t xml:space="preserve"> from Lab 01 with the following methods: </w:t>
+        <w:t xml:space="preserve"> from Lab 01 — </w:t>
       </w:r>
       <w:r>
         <w:rPr>
@@ -411,7 +411,59 @@
           <w:sz w:val="22"/>
           <w:szCs w:val="22"/>
         </w:rPr>
-        <w:t xml:space="preserve">. Paste it into the homework notebook before starting.</w:t>
+        <w:t xml:space="preserve"> — is </w:t>
+      </w:r>
+      <w:r>
+        <w:rPr>
+          <w:rFonts w:ascii="Cambria" w:cs="Cambria" w:eastAsia="Cambria" w:hAnsi="Cambria"/>
+          <w:b/>
+          <w:bCs/>
+          <w:color w:val="333333"/>
+          <w:sz w:val="22"/>
+          <w:szCs w:val="22"/>
+        </w:rPr>
+        <w:t xml:space="preserve">already provided in the homework notebook</w:t>
+      </w:r>
+      <w:r>
+        <w:rPr>
+          <w:rFonts w:ascii="Cambria" w:cs="Cambria" w:eastAsia="Cambria" w:hAnsi="Cambria"/>
+          <w:color w:val="333333"/>
+          <w:sz w:val="22"/>
+          <w:szCs w:val="22"/>
+        </w:rPr>
+        <w:t xml:space="preserve">, so you can start straight away; just run the setup cells.</w:t>
+      </w:r>
+    </w:p>
+    <w:p>
+      <w:pPr>
+        <w:spacing w:after="160" w:line="300"/>
+      </w:pPr>
+      <w:r>
+        <w:rPr>
+          <w:rFonts w:ascii="Cambria" w:cs="Cambria" w:eastAsia="Cambria" w:hAnsi="Cambria"/>
+          <w:color w:val="333333"/>
+          <w:sz w:val="22"/>
+          <w:szCs w:val="22"/>
+        </w:rPr>
+        <w:t xml:space="preserve">If you would rather use your own Lab 01 implementation, you are welcome to replace it, but check that it passes the Lab 01 tests first: a bug in </w:t>
+      </w:r>
+      <w:r>
+        <w:rPr>
+          <w:rFonts w:ascii="Cambria Math" w:cs="Cambria Math" w:eastAsia="Cambria Math" w:hAnsi="Cambria Math"/>
+          <w:color w:val="333333"/>
+          <w:sz w:val="22"/>
+          <w:szCs w:val="22"/>
+        </w:rPr>
+        <w:t xml:space="preserve">inverse_kinematics</w:t>
+      </w:r>
+      <w:r>
+        <w:rPr>
+          <w:rFonts w:ascii="Cambria" w:cs="Cambria" w:eastAsia="Cambria" w:hAnsi="Cambria"/>
+          <w:color w:val="333333"/>
+          <w:sz w:val="22"/>
+          <w:szCs w:val="22"/>
+        </w:rPr>
+        <w:t xml:space="preserve"> will propagate silently through Parts 1–4.</w:t>
       </w:r>
     </w:p>
     <w:p>
@@ -429,6 +481,37 @@
           <w:szCs w:val="30"/>
         </w:rPr>
         <w:t xml:space="preserve">Part 1: Experiment Design (20 pts)</w:t>
+      </w:r>
+    </w:p>
+    <w:p>
+      <w:pPr>
+        <w:pBdr>
+          <w:left w:val="single" w:sz="12" w:space="6" w:color="2E86AB"/>
+        </w:pBdr>
+        <w:spacing w:after="160" w:line="280"/>
+        <w:ind w:left="140"/>
+      </w:pPr>
+      <w:r>
+        <w:rPr>
+          <w:rFonts w:ascii="Georgia" w:cs="Georgia" w:eastAsia="Georgia" w:hAnsi="Georgia"/>
+          <w:b/>
+          <w:bCs/>
+          <w:color w:val="2E86AB"/>
+          <w:sz w:val="19"/>
+          <w:szCs w:val="19"/>
+        </w:rPr>
+        <w:t xml:space="preserve">Lecture notes: </w:t>
+      </w:r>
+      <w:r>
+        <w:rPr>
+          <w:rFonts w:ascii="Cambria" w:cs="Cambria" w:eastAsia="Cambria" w:hAnsi="Cambria"/>
+          <w:i/>
+          <w:iCs/>
+          <w:color w:val="555555"/>
+          <w:sz w:val="19"/>
+          <w:szCs w:val="19"/>
+        </w:rPr>
+        <w:t xml:space="preserve">§2.1 Geometric Derivation — Eqs. 2.2a–b are the forward kinematics used in Task 1.1. §2.3 The Workspace and Figure 3 — the crescent that decides which targets are reachable in Task 1.2. §3.1 Solving for θ₂ — why a target beyond r = l₁ + l₂ has no IK solution, and why only θ₂ &gt; 0 is anatomically valid.</w:t>
       </w:r>
     </w:p>
     <w:p>
@@ -462,7 +545,74 @@
           <w:sz w:val="22"/>
           <w:szCs w:val="22"/>
         </w:rPr>
-        <w:t xml:space="preserve">Use θ₁ = 55°, θ₂ = 75°. Compute the hand position using FK and verify the posture is valid.</w:t>
+        <w:t xml:space="preserve">Use </w:t>
+      </w:r>
+      <w:r>
+        <w:rPr>
+          <w:rFonts w:ascii="Cambria" w:cs="Cambria" w:eastAsia="Cambria" w:hAnsi="Cambria"/>
+          <w:b/>
+          <w:bCs/>
+          <w:color w:val="333333"/>
+          <w:sz w:val="22"/>
+          <w:szCs w:val="22"/>
+        </w:rPr>
+        <w:t xml:space="preserve">θ₁ = 55°, θ₂ = 75°</w:t>
+      </w:r>
+      <w:r>
+        <w:rPr>
+          <w:rFonts w:ascii="Cambria" w:cs="Cambria" w:eastAsia="Cambria" w:hAnsi="Cambria"/>
+          <w:color w:val="333333"/>
+          <w:sz w:val="22"/>
+          <w:szCs w:val="22"/>
+        </w:rPr>
+        <w:t xml:space="preserve">. </w:t>
+      </w:r>
+      <w:r>
+        <w:rPr>
+          <w:rFonts w:ascii="Cambria" w:cs="Cambria" w:eastAsia="Cambria" w:hAnsi="Cambria"/>
+          <w:b/>
+          <w:bCs/>
+          <w:color w:val="333333"/>
+          <w:sz w:val="22"/>
+          <w:szCs w:val="22"/>
+        </w:rPr>
+        <w:t xml:space="preserve">You write 1 line</w:t>
+      </w:r>
+      <w:r>
+        <w:rPr>
+          <w:rFonts w:ascii="Cambria" w:cs="Cambria" w:eastAsia="Cambria" w:hAnsi="Cambria"/>
+          <w:color w:val="333333"/>
+          <w:sz w:val="22"/>
+          <w:szCs w:val="22"/>
+        </w:rPr>
+        <w:t xml:space="preserve">: compute the start hand position with forward kinematics.</w:t>
+      </w:r>
+    </w:p>
+    <w:p>
+      <w:pPr>
+        <w:spacing w:after="160" w:line="300"/>
+      </w:pPr>
+      <w:r>
+        <w:rPr>
+          <w:rFonts w:ascii="Cambria" w:cs="Cambria" w:eastAsia="Cambria" w:hAnsi="Cambria"/>
+          <w:i/>
+          <w:iCs/>
+          <w:color w:val="555555"/>
+          <w:sz w:val="22"/>
+          <w:szCs w:val="22"/>
+        </w:rPr>
+        <w:t xml:space="preserve">Provided in the notebook: </w:t>
+      </w:r>
+      <w:r>
+        <w:rPr>
+          <w:rFonts w:ascii="Cambria" w:cs="Cambria" w:eastAsia="Cambria" w:hAnsi="Cambria"/>
+          <w:i/>
+          <w:iCs/>
+          <w:color w:val="555555"/>
+          <w:sz w:val="22"/>
+          <w:szCs w:val="22"/>
+        </w:rPr>
+        <w:t xml:space="preserve">the posture, the print statements, and the validity check.</w:t>
       </w:r>
     </w:p>
     <w:p>
@@ -496,601 +646,27 @@
           <w:sz w:val="22"/>
           <w:szCs w:val="22"/>
         </w:rPr>
-        <w:t xml:space="preserve">Place 8 targets at 10 cm from the start position, equally spaced at 0°, 45°, 90°, …, 315° (where 0° = rightward, 90° = forward). COMPLETE the code to:</w:t>
-      </w:r>
-    </w:p>
-    <w:p>
-      <w:pPr>
-        <w:pStyle w:val="ListParagraph"/>
-        <w:numPr>
-          <w:ilvl w:val="0"/>
-          <w:numId w:val="2"/>
-        </w:numPr>
-        <w:spacing w:after="100" w:line="300"/>
-      </w:pPr>
-      <w:r>
-        <w:rPr>
-          <w:rFonts w:ascii="Cambria" w:cs="Cambria" w:eastAsia="Cambria" w:hAnsi="Cambria"/>
-          <w:color w:val="333333"/>
-          <w:sz w:val="22"/>
-          <w:szCs w:val="22"/>
-        </w:rPr>
-        <w:t xml:space="preserve">Compute all 8 target positions</w:t>
-      </w:r>
-    </w:p>
-    <w:p>
-      <w:pPr>
-        <w:pStyle w:val="ListParagraph"/>
-        <w:numPr>
-          <w:ilvl w:val="0"/>
-          <w:numId w:val="2"/>
-        </w:numPr>
-        <w:spacing w:after="100" w:line="300"/>
-      </w:pPr>
-      <w:r>
-        <w:rPr>
-          <w:rFonts w:ascii="Cambria" w:cs="Cambria" w:eastAsia="Cambria" w:hAnsi="Cambria"/>
-          <w:color w:val="333333"/>
-          <w:sz w:val="22"/>
-          <w:szCs w:val="22"/>
-        </w:rPr>
-        <w:t xml:space="preserve">Check which targets are reachable (have valid IK solutions)</w:t>
-      </w:r>
-    </w:p>
-    <w:p>
-      <w:pPr>
-        <w:pStyle w:val="ListParagraph"/>
-        <w:numPr>
-          <w:ilvl w:val="0"/>
-          <w:numId w:val="2"/>
-        </w:numPr>
-        <w:spacing w:after="100" w:line="300"/>
-      </w:pPr>
-      <w:r>
-        <w:rPr>
-          <w:rFonts w:ascii="Cambria" w:cs="Cambria" w:eastAsia="Cambria" w:hAnsi="Cambria"/>
-          <w:color w:val="333333"/>
-          <w:sz w:val="22"/>
-          <w:szCs w:val="22"/>
-        </w:rPr>
-        <w:t xml:space="preserve">Plot the start position, all 8 targets (green = reachable, red = unreachable), and the arm at the start posture</w:t>
-      </w:r>
-    </w:p>
-    <w:p>
-      <w:pPr>
-        <w:pStyle w:val="Heading2"/>
-        <w:pBdr>
-          <w:bottom w:val="single" w:color="2E86AB" w:sz="1" w:space="4"/>
-        </w:pBdr>
-        <w:spacing w:after="160" w:before="300"/>
-      </w:pPr>
-      <w:r>
-        <w:rPr>
-          <w:rFonts w:ascii="Georgia" w:cs="Georgia" w:eastAsia="Georgia" w:hAnsi="Georgia"/>
-          <w:b/>
-          <w:bCs/>
-          <w:color w:val="2E86AB"/>
-          <w:sz w:val="24"/>
-          <w:szCs w:val="24"/>
-        </w:rPr>
-        <w:t xml:space="preserve">Question 1.1 (5 pts)</w:t>
-      </w:r>
-    </w:p>
-    <w:p>
-      <w:pPr>
-        <w:spacing w:after="160" w:line="300"/>
-      </w:pPr>
-      <w:r>
-        <w:rPr>
-          <w:rFonts w:ascii="Cambria" w:cs="Cambria" w:eastAsia="Cambria" w:hAnsi="Cambria"/>
-          <w:color w:val="333333"/>
-          <w:sz w:val="22"/>
-          <w:szCs w:val="22"/>
-        </w:rPr>
-        <w:t xml:space="preserve">Are all 8 targets reachable? If any are not, explain why in terms of the workspace geometry.</w:t>
-      </w:r>
-    </w:p>
-    <w:p>
-      <w:pPr>
-        <w:pStyle w:val="Heading1"/>
-        <w:spacing w:after="200" w:before="360"/>
-      </w:pPr>
-      <w:r>
-        <w:rPr>
-          <w:rFonts w:ascii="Georgia" w:cs="Georgia" w:eastAsia="Georgia" w:hAnsi="Georgia"/>
-          <w:b/>
-          <w:bCs/>
-          <w:color w:val="1B2A4A"/>
-          <w:sz w:val="30"/>
-          <w:szCs w:val="30"/>
-        </w:rPr>
-        <w:t xml:space="preserve">Part 2: Manipulability Analysis (25 pts)</w:t>
-      </w:r>
-    </w:p>
-    <w:p>
-      <w:pPr>
-        <w:pStyle w:val="Heading2"/>
-        <w:pBdr>
-          <w:bottom w:val="single" w:color="2E86AB" w:sz="1" w:space="4"/>
-        </w:pBdr>
-        <w:spacing w:after="160" w:before="300"/>
-      </w:pPr>
-      <w:r>
-        <w:rPr>
-          <w:rFonts w:ascii="Georgia" w:cs="Georgia" w:eastAsia="Georgia" w:hAnsi="Georgia"/>
-          <w:b/>
-          <w:bCs/>
-          <w:color w:val="2E86AB"/>
-          <w:sz w:val="24"/>
-          <w:szCs w:val="24"/>
-        </w:rPr>
-        <w:t xml:space="preserve">Task 2.1 — Compute the Manipulability Ellipsoid (10 pts)</w:t>
-      </w:r>
-    </w:p>
-    <w:p>
-      <w:pPr>
-        <w:spacing w:after="160" w:line="300"/>
-      </w:pPr>
-      <w:r>
-        <w:rPr>
-          <w:rFonts w:ascii="Cambria" w:cs="Cambria" w:eastAsia="Cambria" w:hAnsi="Cambria"/>
-          <w:color w:val="333333"/>
-          <w:sz w:val="22"/>
-          <w:szCs w:val="22"/>
-        </w:rPr>
-        <w:t xml:space="preserve">At the start posture, COMPLETE the code to:</w:t>
-      </w:r>
-    </w:p>
-    <w:p>
-      <w:pPr>
-        <w:pStyle w:val="ListParagraph"/>
-        <w:numPr>
-          <w:ilvl w:val="0"/>
-          <w:numId w:val="2"/>
-        </w:numPr>
-        <w:spacing w:after="100" w:line="300"/>
-      </w:pPr>
-      <w:r>
-        <w:rPr>
-          <w:rFonts w:ascii="Cambria" w:cs="Cambria" w:eastAsia="Cambria" w:hAnsi="Cambria"/>
-          <w:color w:val="333333"/>
-          <w:sz w:val="22"/>
-          <w:szCs w:val="22"/>
-        </w:rPr>
-        <w:t xml:space="preserve">Compute A = JJᵀ and eigendecompose it</w:t>
-      </w:r>
-    </w:p>
-    <w:p>
-      <w:pPr>
-        <w:pStyle w:val="ListParagraph"/>
-        <w:numPr>
-          <w:ilvl w:val="0"/>
-          <w:numId w:val="2"/>
-        </w:numPr>
-        <w:spacing w:after="100" w:line="300"/>
-      </w:pPr>
-      <w:r>
-        <w:rPr>
-          <w:rFonts w:ascii="Cambria" w:cs="Cambria" w:eastAsia="Cambria" w:hAnsi="Cambria"/>
-          <w:color w:val="333333"/>
-          <w:sz w:val="22"/>
-          <w:szCs w:val="22"/>
-        </w:rPr>
-        <w:t xml:space="preserve">Plot the arm with the manipulability ellipsoid overlaid at the hand</w:t>
-      </w:r>
-    </w:p>
-    <w:p>
-      <w:pPr>
-        <w:pStyle w:val="ListParagraph"/>
-        <w:numPr>
-          <w:ilvl w:val="0"/>
-          <w:numId w:val="2"/>
-        </w:numPr>
-        <w:spacing w:after="100" w:line="300"/>
-      </w:pPr>
-      <w:r>
-        <w:rPr>
-          <w:rFonts w:ascii="Cambria" w:cs="Cambria" w:eastAsia="Cambria" w:hAnsi="Cambria"/>
-          <w:color w:val="333333"/>
-          <w:sz w:val="22"/>
-          <w:szCs w:val="22"/>
-        </w:rPr>
-        <w:t xml:space="preserve">Draw and label the major (easy) and minor (hard) principal axes</w:t>
-      </w:r>
-    </w:p>
-    <w:p>
-      <w:pPr>
-        <w:pStyle w:val="ListParagraph"/>
-        <w:numPr>
-          <w:ilvl w:val="0"/>
-          <w:numId w:val="2"/>
-        </w:numPr>
-        <w:spacing w:after="100" w:line="300"/>
-      </w:pPr>
-      <w:r>
-        <w:rPr>
-          <w:rFonts w:ascii="Cambria" w:cs="Cambria" w:eastAsia="Cambria" w:hAnsi="Cambria"/>
-          <w:color w:val="333333"/>
-          <w:sz w:val="22"/>
-          <w:szCs w:val="22"/>
-        </w:rPr>
-        <w:t xml:space="preserve">Report the eigenvalues, the condition number (√(λₘₐₓ/λₘᵢₙ)), and Yoshikawa’s w</w:t>
-      </w:r>
-    </w:p>
-    <w:p>
-      <w:pPr>
-        <w:pStyle w:val="Heading2"/>
-        <w:pBdr>
-          <w:bottom w:val="single" w:color="2E86AB" w:sz="1" w:space="4"/>
-        </w:pBdr>
-        <w:spacing w:after="160" w:before="300"/>
-      </w:pPr>
-      <w:r>
-        <w:rPr>
-          <w:rFonts w:ascii="Georgia" w:cs="Georgia" w:eastAsia="Georgia" w:hAnsi="Georgia"/>
-          <w:b/>
-          <w:bCs/>
-          <w:color w:val="2E86AB"/>
-          <w:sz w:val="24"/>
-          <w:szCs w:val="24"/>
-        </w:rPr>
-        <w:t xml:space="preserve">Task 2.2 — Identify Easy and Hard Directions (10 pts)</w:t>
-      </w:r>
-    </w:p>
-    <w:p>
-      <w:pPr>
-        <w:spacing w:after="160" w:line="300"/>
-      </w:pPr>
-      <w:r>
-        <w:rPr>
-          <w:rFonts w:ascii="Cambria" w:cs="Cambria" w:eastAsia="Cambria" w:hAnsi="Cambria"/>
-          <w:color w:val="333333"/>
-          <w:sz w:val="22"/>
-          <w:szCs w:val="22"/>
-        </w:rPr>
-        <w:t xml:space="preserve">The major axis of the ellipsoid is the direction in which the hand moves most easily. The minor axis is the hardest direction. COMPLETE the code to:</w:t>
-      </w:r>
-    </w:p>
-    <w:p>
-      <w:pPr>
-        <w:pStyle w:val="ListParagraph"/>
-        <w:numPr>
-          <w:ilvl w:val="0"/>
-          <w:numId w:val="2"/>
-        </w:numPr>
-        <w:spacing w:after="100" w:line="300"/>
-      </w:pPr>
-      <w:r>
-        <w:rPr>
-          <w:rFonts w:ascii="Cambria" w:cs="Cambria" w:eastAsia="Cambria" w:hAnsi="Cambria"/>
-          <w:color w:val="333333"/>
-          <w:sz w:val="22"/>
-          <w:szCs w:val="22"/>
-        </w:rPr>
-        <w:t xml:space="preserve">Compute the angle of each principal axis</w:t>
-      </w:r>
-    </w:p>
-    <w:p>
-      <w:pPr>
-        <w:pStyle w:val="ListParagraph"/>
-        <w:numPr>
-          <w:ilvl w:val="0"/>
-          <w:numId w:val="2"/>
-        </w:numPr>
-        <w:spacing w:after="100" w:line="300"/>
-      </w:pPr>
-      <w:r>
-        <w:rPr>
-          <w:rFonts w:ascii="Cambria" w:cs="Cambria" w:eastAsia="Cambria" w:hAnsi="Cambria"/>
-          <w:color w:val="333333"/>
-          <w:sz w:val="22"/>
-          <w:szCs w:val="22"/>
-        </w:rPr>
-        <w:t xml:space="preserve">Find which of the 8 targets is closest to the easy direction and which is closest to the hard direction</w:t>
-      </w:r>
-    </w:p>
-    <w:p>
-      <w:pPr>
-        <w:spacing w:after="160" w:line="300"/>
-      </w:pPr>
-      <w:r>
-        <w:rPr>
-          <w:rFonts w:ascii="Cambria" w:cs="Cambria" w:eastAsia="Cambria" w:hAnsi="Cambria"/>
-          <w:i/>
-          <w:iCs/>
-          <w:color w:val="333333"/>
-          <w:sz w:val="22"/>
-          <w:szCs w:val="22"/>
-        </w:rPr>
-        <w:t xml:space="preserve">Hint: remember that directions 180° apart are equivalent for an ellipsoid axis.</w:t>
-      </w:r>
-    </w:p>
-    <w:p>
-      <w:pPr>
-        <w:pStyle w:val="Heading2"/>
-        <w:pBdr>
-          <w:bottom w:val="single" w:color="2E86AB" w:sz="1" w:space="4"/>
-        </w:pBdr>
-        <w:spacing w:after="160" w:before="300"/>
-      </w:pPr>
-      <w:r>
-        <w:rPr>
-          <w:rFonts w:ascii="Georgia" w:cs="Georgia" w:eastAsia="Georgia" w:hAnsi="Georgia"/>
-          <w:b/>
-          <w:bCs/>
-          <w:color w:val="2E86AB"/>
-          <w:sz w:val="24"/>
-          <w:szCs w:val="24"/>
-        </w:rPr>
-        <w:t xml:space="preserve">Question 2.1 (5 pts)</w:t>
-      </w:r>
-    </w:p>
-    <w:p>
-      <w:pPr>
-        <w:spacing w:after="160" w:line="300"/>
-      </w:pPr>
-      <w:r>
-        <w:rPr>
-          <w:rFonts w:ascii="Cambria" w:cs="Cambria" w:eastAsia="Cambria" w:hAnsi="Cambria"/>
-          <w:color w:val="333333"/>
-          <w:sz w:val="22"/>
-          <w:szCs w:val="22"/>
-        </w:rPr>
-        <w:t xml:space="preserve">In your own words, explain what the manipulability ellipsoid tells us about reaching in the easy vs. hard direction. What specific kinematic quantity is larger/smaller in each direction?</w:t>
-      </w:r>
-    </w:p>
-    <w:p>
-      <w:pPr>
-        <w:pStyle w:val="Heading1"/>
-        <w:spacing w:after="200" w:before="360"/>
-      </w:pPr>
-      <w:r>
-        <w:rPr>
-          <w:rFonts w:ascii="Georgia" w:cs="Georgia" w:eastAsia="Georgia" w:hAnsi="Georgia"/>
-          <w:b/>
-          <w:bCs/>
-          <w:color w:val="1B2A4A"/>
-          <w:sz w:val="30"/>
-          <w:szCs w:val="30"/>
-        </w:rPr>
-        <w:t xml:space="preserve">Part 3: Predictions for Two Reaches (35 pts)</w:t>
-      </w:r>
-    </w:p>
-    <w:p>
-      <w:pPr>
-        <w:spacing w:after="160" w:line="300"/>
-      </w:pPr>
-      <w:r>
-        <w:rPr>
-          <w:rFonts w:ascii="Cambria" w:cs="Cambria" w:eastAsia="Cambria" w:hAnsi="Cambria"/>
-          <w:color w:val="333333"/>
-          <w:sz w:val="22"/>
-          <w:szCs w:val="22"/>
-        </w:rPr>
-        <w:t xml:space="preserve">Now analyze your two selected reaches in detail: one toward the </w:t>
-      </w:r>
-      <w:r>
-        <w:rPr>
-          <w:rFonts w:ascii="Cambria" w:cs="Cambria" w:eastAsia="Cambria" w:hAnsi="Cambria"/>
-          <w:b/>
-          <w:bCs/>
-          <w:color w:val="333333"/>
-          <w:sz w:val="22"/>
-          <w:szCs w:val="22"/>
-        </w:rPr>
-        <w:t xml:space="preserve">easy target</w:t>
-      </w:r>
-      <w:r>
-        <w:rPr>
-          <w:rFonts w:ascii="Cambria" w:cs="Cambria" w:eastAsia="Cambria" w:hAnsi="Cambria"/>
-          <w:color w:val="333333"/>
-          <w:sz w:val="22"/>
-          <w:szCs w:val="22"/>
-        </w:rPr>
-        <w:t xml:space="preserve"> and one toward the </w:t>
-      </w:r>
-      <w:r>
-        <w:rPr>
-          <w:rFonts w:ascii="Cambria" w:cs="Cambria" w:eastAsia="Cambria" w:hAnsi="Cambria"/>
-          <w:b/>
-          <w:bCs/>
-          <w:color w:val="333333"/>
-          <w:sz w:val="22"/>
-          <w:szCs w:val="22"/>
-        </w:rPr>
-        <w:t xml:space="preserve">hard target</w:t>
-      </w:r>
-      <w:r>
-        <w:rPr>
-          <w:rFonts w:ascii="Cambria" w:cs="Cambria" w:eastAsia="Cambria" w:hAnsi="Cambria"/>
-          <w:color w:val="333333"/>
-          <w:sz w:val="22"/>
-          <w:szCs w:val="22"/>
-        </w:rPr>
-        <w:t xml:space="preserve">.</w:t>
-      </w:r>
-    </w:p>
-    <w:p>
-      <w:pPr>
-        <w:pStyle w:val="Heading2"/>
-        <w:pBdr>
-          <w:bottom w:val="single" w:color="2E86AB" w:sz="1" w:space="4"/>
-        </w:pBdr>
-        <w:spacing w:after="160" w:before="300"/>
-      </w:pPr>
-      <w:r>
-        <w:rPr>
-          <w:rFonts w:ascii="Georgia" w:cs="Georgia" w:eastAsia="Georgia" w:hAnsi="Georgia"/>
-          <w:b/>
-          <w:bCs/>
-          <w:color w:val="2E86AB"/>
-          <w:sz w:val="24"/>
-          <w:szCs w:val="24"/>
-        </w:rPr>
-        <w:t xml:space="preserve">Task 3.1 — Joint-Level Requirements (15 pts)</w:t>
-      </w:r>
-    </w:p>
-    <w:p>
-      <w:pPr>
-        <w:spacing w:after="160" w:line="300"/>
-      </w:pPr>
-      <w:r>
-        <w:rPr>
-          <w:rFonts w:ascii="Cambria" w:cs="Cambria" w:eastAsia="Cambria" w:hAnsi="Cambria"/>
-          <w:color w:val="333333"/>
-          <w:sz w:val="22"/>
-          <w:szCs w:val="22"/>
-        </w:rPr>
-        <w:t xml:space="preserve">For each of the two target directions, COMPLETE the code to:</w:t>
-      </w:r>
-    </w:p>
-    <w:p>
-      <w:pPr>
-        <w:pStyle w:val="ListParagraph"/>
-        <w:numPr>
-          <w:ilvl w:val="0"/>
-          <w:numId w:val="2"/>
-        </w:numPr>
-        <w:spacing w:after="100" w:line="300"/>
-      </w:pPr>
-      <w:r>
-        <w:rPr>
-          <w:rFonts w:ascii="Cambria" w:cs="Cambria" w:eastAsia="Cambria" w:hAnsi="Cambria"/>
-          <w:color w:val="333333"/>
-          <w:sz w:val="22"/>
-          <w:szCs w:val="22"/>
-        </w:rPr>
-        <w:t xml:space="preserve">Solve IK for the target position</w:t>
-      </w:r>
-    </w:p>
-    <w:p>
-      <w:pPr>
-        <w:pStyle w:val="ListParagraph"/>
-        <w:numPr>
-          <w:ilvl w:val="0"/>
-          <w:numId w:val="2"/>
-        </w:numPr>
-        <w:spacing w:after="100" w:line="300"/>
-      </w:pPr>
-      <w:r>
-        <w:rPr>
-          <w:rFonts w:ascii="Cambria" w:cs="Cambria" w:eastAsia="Cambria" w:hAnsi="Cambria"/>
-          <w:color w:val="333333"/>
-          <w:sz w:val="22"/>
-          <w:szCs w:val="22"/>
-        </w:rPr>
-        <w:t xml:space="preserve">Compute the joint displacement: Δq = q_target − q_start</w:t>
-      </w:r>
-    </w:p>
-    <w:p>
-      <w:pPr>
-        <w:pStyle w:val="ListParagraph"/>
-        <w:numPr>
-          <w:ilvl w:val="0"/>
-          <w:numId w:val="2"/>
-        </w:numPr>
-        <w:spacing w:after="100" w:line="300"/>
-      </w:pPr>
-      <w:r>
-        <w:rPr>
-          <w:rFonts w:ascii="Cambria" w:cs="Cambria" w:eastAsia="Cambria" w:hAnsi="Cambria"/>
-          <w:color w:val="333333"/>
-          <w:sz w:val="22"/>
-          <w:szCs w:val="22"/>
-        </w:rPr>
-        <w:t xml:space="preserve">Compute ‖Δq‖ (the total joint excursion in radians)</w:t>
-      </w:r>
-    </w:p>
-    <w:p>
-      <w:pPr>
-        <w:pStyle w:val="ListParagraph"/>
-        <w:numPr>
-          <w:ilvl w:val="0"/>
-          <w:numId w:val="2"/>
-        </w:numPr>
-        <w:spacing w:after="100" w:line="300"/>
-      </w:pPr>
-      <w:r>
-        <w:rPr>
-          <w:rFonts w:ascii="Cambria" w:cs="Cambria" w:eastAsia="Cambria" w:hAnsi="Cambria"/>
-          <w:color w:val="333333"/>
-          <w:sz w:val="22"/>
-          <w:szCs w:val="22"/>
-        </w:rPr>
-        <w:t xml:space="preserve">Compute the Jacobian condition number at the target posture</w:t>
-      </w:r>
-    </w:p>
-    <w:p>
-      <w:pPr>
-        <w:pStyle w:val="ListParagraph"/>
-        <w:numPr>
-          <w:ilvl w:val="0"/>
-          <w:numId w:val="2"/>
-        </w:numPr>
-        <w:spacing w:after="100" w:line="300"/>
-      </w:pPr>
-      <w:r>
-        <w:rPr>
-          <w:rFonts w:ascii="Cambria" w:cs="Cambria" w:eastAsia="Cambria" w:hAnsi="Cambria"/>
-          <w:color w:val="333333"/>
-          <w:sz w:val="22"/>
-          <w:szCs w:val="22"/>
-        </w:rPr>
-        <w:t xml:space="preserve">Print a comparison table</w:t>
-      </w:r>
-    </w:p>
-    <w:p>
-      <w:pPr>
-        <w:pStyle w:val="Heading2"/>
-        <w:pBdr>
-          <w:bottom w:val="single" w:color="2E86AB" w:sz="1" w:space="4"/>
-        </w:pBdr>
-        <w:spacing w:after="160" w:before="300"/>
-      </w:pPr>
-      <w:r>
-        <w:rPr>
-          <w:rFonts w:ascii="Georgia" w:cs="Georgia" w:eastAsia="Georgia" w:hAnsi="Georgia"/>
-          <w:b/>
-          <w:bCs/>
-          <w:color w:val="2E86AB"/>
-          <w:sz w:val="24"/>
-          <w:szCs w:val="24"/>
-        </w:rPr>
-        <w:t xml:space="preserve">Task 3.2 — Visualize Both Reaches (10 pts)</w:t>
-      </w:r>
-    </w:p>
-    <w:p>
-      <w:pPr>
-        <w:spacing w:after="160" w:line="300"/>
-      </w:pPr>
-      <w:r>
-        <w:rPr>
-          <w:rFonts w:ascii="Cambria" w:cs="Cambria" w:eastAsia="Cambria" w:hAnsi="Cambria"/>
-          <w:color w:val="333333"/>
-          <w:sz w:val="22"/>
-          <w:szCs w:val="22"/>
-        </w:rPr>
-        <w:t xml:space="preserve">Create a </w:t>
-      </w:r>
-      <w:r>
-        <w:rPr>
-          <w:rFonts w:ascii="Cambria" w:cs="Cambria" w:eastAsia="Cambria" w:hAnsi="Cambria"/>
-          <w:b/>
-          <w:bCs/>
-          <w:color w:val="333333"/>
-          <w:sz w:val="22"/>
-          <w:szCs w:val="22"/>
-        </w:rPr>
-        <w:t xml:space="preserve">single figure with two panels</w:t>
-      </w:r>
-      <w:r>
-        <w:rPr>
-          <w:rFonts w:ascii="Cambria" w:cs="Cambria" w:eastAsia="Cambria" w:hAnsi="Cambria"/>
-          <w:color w:val="333333"/>
-          <w:sz w:val="22"/>
-          <w:szCs w:val="22"/>
-        </w:rPr>
-        <w:t xml:space="preserve"> (side by side):</w:t>
+        <w:t xml:space="preserve">Place 8 targets at 10 cm (0.10 m) from the start position, equally spaced at 0°, 45°, 90°, …, 315° (0° = rightward, 90° = forward/upward in our frame). </w:t>
+      </w:r>
+      <w:r>
+        <w:rPr>
+          <w:rFonts w:ascii="Cambria" w:cs="Cambria" w:eastAsia="Cambria" w:hAnsi="Cambria"/>
+          <w:b/>
+          <w:bCs/>
+          <w:color w:val="333333"/>
+          <w:sz w:val="22"/>
+          <w:szCs w:val="22"/>
+        </w:rPr>
+        <w:t xml:space="preserve">You write 2 lines</w:t>
+      </w:r>
+      <w:r>
+        <w:rPr>
+          <w:rFonts w:ascii="Cambria" w:cs="Cambria" w:eastAsia="Cambria" w:hAnsi="Cambria"/>
+          <w:color w:val="333333"/>
+          <w:sz w:val="22"/>
+          <w:szCs w:val="22"/>
+        </w:rPr>
+        <w:t xml:space="preserve">:</w:t>
       </w:r>
     </w:p>
     <w:p>
@@ -1109,7 +685,7 @@
           <w:sz w:val="22"/>
           <w:szCs w:val="22"/>
         </w:rPr>
-        <w:t xml:space="preserve">Left panel: the easy reach (arm at start posture in light color, arm at target posture in bold)</w:t>
+        <w:t xml:space="preserve">the position of each target (start position + a 10 cm step in the given direction)</w:t>
       </w:r>
     </w:p>
     <w:p>
@@ -1128,7 +704,170 @@
           <w:sz w:val="22"/>
           <w:szCs w:val="22"/>
         </w:rPr>
-        <w:t xml:space="preserve">Right panel: the hard reach (same format)</w:t>
+        <w:t xml:space="preserve">whether each target is reachable (has at least one valid IK solution)</w:t>
+      </w:r>
+    </w:p>
+    <w:p>
+      <w:pPr>
+        <w:spacing w:after="160" w:line="300"/>
+      </w:pPr>
+      <w:r>
+        <w:rPr>
+          <w:rFonts w:ascii="Cambria" w:cs="Cambria" w:eastAsia="Cambria" w:hAnsi="Cambria"/>
+          <w:i/>
+          <w:iCs/>
+          <w:color w:val="555555"/>
+          <w:sz w:val="22"/>
+          <w:szCs w:val="22"/>
+        </w:rPr>
+        <w:t xml:space="preserve">Provided in the notebook: </w:t>
+      </w:r>
+      <w:r>
+        <w:rPr>
+          <w:rFonts w:ascii="Cambria" w:cs="Cambria" w:eastAsia="Cambria" w:hAnsi="Cambria"/>
+          <w:i/>
+          <w:iCs/>
+          <w:color w:val="555555"/>
+          <w:sz w:val="22"/>
+          <w:szCs w:val="22"/>
+        </w:rPr>
+        <w:t xml:space="preserve">the plot (arm + targets coloured green/red by reachability) and the reachability printout.</w:t>
+      </w:r>
+    </w:p>
+    <w:p>
+      <w:pPr>
+        <w:pStyle w:val="Heading2"/>
+        <w:pBdr>
+          <w:bottom w:val="single" w:color="2E86AB" w:sz="1" w:space="4"/>
+        </w:pBdr>
+        <w:spacing w:after="160" w:before="300"/>
+      </w:pPr>
+      <w:r>
+        <w:rPr>
+          <w:rFonts w:ascii="Georgia" w:cs="Georgia" w:eastAsia="Georgia" w:hAnsi="Georgia"/>
+          <w:b/>
+          <w:bCs/>
+          <w:color w:val="2E86AB"/>
+          <w:sz w:val="24"/>
+          <w:szCs w:val="24"/>
+        </w:rPr>
+        <w:t xml:space="preserve">Question 1.1 (5 pts)</w:t>
+      </w:r>
+    </w:p>
+    <w:p>
+      <w:pPr>
+        <w:spacing w:after="160" w:line="300"/>
+      </w:pPr>
+      <w:r>
+        <w:rPr>
+          <w:rFonts w:ascii="Cambria" w:cs="Cambria" w:eastAsia="Cambria" w:hAnsi="Cambria"/>
+          <w:color w:val="333333"/>
+          <w:sz w:val="22"/>
+          <w:szCs w:val="22"/>
+        </w:rPr>
+        <w:t xml:space="preserve">Are all 8 targets reachable? If any are not, explain why in terms of the workspace geometry.</w:t>
+      </w:r>
+    </w:p>
+    <w:p>
+      <w:pPr>
+        <w:pStyle w:val="Heading1"/>
+        <w:spacing w:after="200" w:before="360"/>
+      </w:pPr>
+      <w:r>
+        <w:rPr>
+          <w:rFonts w:ascii="Georgia" w:cs="Georgia" w:eastAsia="Georgia" w:hAnsi="Georgia"/>
+          <w:b/>
+          <w:bCs/>
+          <w:color w:val="1B2A4A"/>
+          <w:sz w:val="30"/>
+          <w:szCs w:val="30"/>
+        </w:rPr>
+        <w:t xml:space="preserve">Part 2: Manipulability Analysis at the Start Posture (25 pts)</w:t>
+      </w:r>
+    </w:p>
+    <w:p>
+      <w:pPr>
+        <w:pBdr>
+          <w:left w:val="single" w:sz="12" w:space="6" w:color="2E86AB"/>
+        </w:pBdr>
+        <w:spacing w:after="160" w:line="280"/>
+        <w:ind w:left="140"/>
+      </w:pPr>
+      <w:r>
+        <w:rPr>
+          <w:rFonts w:ascii="Georgia" w:cs="Georgia" w:eastAsia="Georgia" w:hAnsi="Georgia"/>
+          <w:b/>
+          <w:bCs/>
+          <w:color w:val="2E86AB"/>
+          <w:sz w:val="19"/>
+          <w:szCs w:val="19"/>
+        </w:rPr>
+        <w:t xml:space="preserve">Lecture notes: </w:t>
+      </w:r>
+      <w:r>
+        <w:rPr>
+          <w:rFonts w:ascii="Cambria" w:cs="Cambria" w:eastAsia="Cambria" w:hAnsi="Cambria"/>
+          <w:i/>
+          <w:iCs/>
+          <w:color w:val="555555"/>
+          <w:sz w:val="19"/>
+          <w:szCs w:val="19"/>
+        </w:rPr>
+        <w:t xml:space="preserve">§5.1 Construction — Eqs. 5.1–5.4 derive the ellipsoid from ‖θ̇‖ = 1. §5.2 Eigenvalue Analysis — eigenvectors give the principal axes you identify in Task 2.2; eigenvalues give squared semi-axis lengths (λᵢ = σᵢ²). §5.3 Yoshikawa’s Manipulability Measure — Eq. 5.5, w = |l₁ l₂ sin θ₂|. Figures 6–8.</w:t>
+      </w:r>
+    </w:p>
+    <w:p>
+      <w:pPr>
+        <w:pStyle w:val="Heading2"/>
+        <w:pBdr>
+          <w:bottom w:val="single" w:color="2E86AB" w:sz="1" w:space="4"/>
+        </w:pBdr>
+        <w:spacing w:after="160" w:before="300"/>
+      </w:pPr>
+      <w:r>
+        <w:rPr>
+          <w:rFonts w:ascii="Georgia" w:cs="Georgia" w:eastAsia="Georgia" w:hAnsi="Georgia"/>
+          <w:b/>
+          <w:bCs/>
+          <w:color w:val="2E86AB"/>
+          <w:sz w:val="24"/>
+          <w:szCs w:val="24"/>
+        </w:rPr>
+        <w:t xml:space="preserve">Task 2.1 — Compute and Plot the Manipulability Ellipsoid (10 pts)</w:t>
+      </w:r>
+    </w:p>
+    <w:p>
+      <w:pPr>
+        <w:spacing w:after="160" w:line="300"/>
+      </w:pPr>
+      <w:r>
+        <w:rPr>
+          <w:rFonts w:ascii="Cambria" w:cs="Cambria" w:eastAsia="Cambria" w:hAnsi="Cambria"/>
+          <w:color w:val="333333"/>
+          <w:sz w:val="22"/>
+          <w:szCs w:val="22"/>
+        </w:rPr>
+        <w:t xml:space="preserve">At the start posture, </w:t>
+      </w:r>
+      <w:r>
+        <w:rPr>
+          <w:rFonts w:ascii="Cambria" w:cs="Cambria" w:eastAsia="Cambria" w:hAnsi="Cambria"/>
+          <w:b/>
+          <w:bCs/>
+          <w:color w:val="333333"/>
+          <w:sz w:val="22"/>
+          <w:szCs w:val="22"/>
+        </w:rPr>
+        <w:t xml:space="preserve">you write 2 lines</w:t>
+      </w:r>
+      <w:r>
+        <w:rPr>
+          <w:rFonts w:ascii="Cambria" w:cs="Cambria" w:eastAsia="Cambria" w:hAnsi="Cambria"/>
+          <w:color w:val="333333"/>
+          <w:sz w:val="22"/>
+          <w:szCs w:val="22"/>
+        </w:rPr>
+        <w:t xml:space="preserve">:</w:t>
       </w:r>
     </w:p>
     <w:p>
@@ -1147,7 +886,7 @@
           <w:sz w:val="22"/>
           <w:szCs w:val="22"/>
         </w:rPr>
-        <w:t xml:space="preserve">Both panels: manipulability ellipsoid at both start and target postures</w:t>
+        <w:t xml:space="preserve">build the manipulability matrix A = JJᵀ</w:t>
       </w:r>
     </w:p>
     <w:p>
@@ -1166,8 +905,155 @@
           <w:sz w:val="22"/>
           <w:szCs w:val="22"/>
         </w:rPr>
-        <w:t xml:space="preserve">Title each panel with the target direction and total joint excursion</w:t>
-      </w:r>
+        <w:t xml:space="preserve">eigendecompose it with </w:t>
+      </w:r>
+      <w:r>
+        <w:rPr>
+          <w:rFonts w:ascii="Cambria Math" w:cs="Cambria Math" w:eastAsia="Cambria Math" w:hAnsi="Cambria Math"/>
+          <w:color w:val="333333"/>
+          <w:sz w:val="22"/>
+          <w:szCs w:val="22"/>
+        </w:rPr>
+        <w:t xml:space="preserve">np.linalg.eigh(A)</w:t>
+      </w:r>
+    </w:p>
+    <w:p>
+      <w:pPr>
+        <w:spacing w:after="160" w:line="300"/>
+      </w:pPr>
+      <w:r>
+        <w:rPr>
+          <w:rFonts w:ascii="Cambria" w:cs="Cambria" w:eastAsia="Cambria" w:hAnsi="Cambria"/>
+          <w:i/>
+          <w:iCs/>
+          <w:color w:val="555555"/>
+          <w:sz w:val="22"/>
+          <w:szCs w:val="22"/>
+        </w:rPr>
+        <w:t xml:space="preserve">Provided in the notebook: </w:t>
+      </w:r>
+      <w:r>
+        <w:rPr>
+          <w:rFonts w:ascii="Cambria" w:cs="Cambria" w:eastAsia="Cambria" w:hAnsi="Cambria"/>
+          <w:i/>
+          <w:iCs/>
+          <w:color w:val="555555"/>
+          <w:sz w:val="22"/>
+          <w:szCs w:val="22"/>
+        </w:rPr>
+        <w:t xml:space="preserve">the Jacobian call, the eigenvalue sorting, the derived condition number √(λₘₐₓ/λₘᵢₙ) and Yoshikawa’s w, the printout, and the ellipsoid plot with its labelled major (easy) and minor (hard) axes.</w:t>
+      </w:r>
+    </w:p>
+    <w:tbl>
+      <w:tblPr>
+        <w:tblW w:type="dxa" w:w="9360"/>
+        <w:tblBorders>
+          <w:top w:val="single" w:color="auto" w:sz="4"/>
+          <w:left w:val="single" w:color="auto" w:sz="4"/>
+          <w:bottom w:val="single" w:color="auto" w:sz="4"/>
+          <w:right w:val="single" w:color="auto" w:sz="4"/>
+          <w:insideH w:val="single" w:color="auto" w:sz="4"/>
+          <w:insideV w:val="single" w:color="auto" w:sz="4"/>
+        </w:tblBorders>
+      </w:tblPr>
+      <w:tblGrid>
+        <w:gridCol w:w="9360"/>
+      </w:tblGrid>
+      <w:tr>
+        <w:tc>
+          <w:tcPr>
+            <w:tcW w:type="dxa" w:w="9360"/>
+            <w:tcBorders>
+              <w:top w:val="single" w:color="2E86AB" w:sz="1"/>
+              <w:left w:val="single" w:color="2E86AB" w:sz="1"/>
+              <w:bottom w:val="single" w:color="2E86AB" w:sz="1"/>
+              <w:right w:val="single" w:color="2E86AB" w:sz="1"/>
+            </w:tcBorders>
+            <w:shd w:fill="E8F1F8" w:val="clear"/>
+            <w:tcMar>
+              <w:top w:type="dxa" w:w="120"/>
+              <w:left w:type="dxa" w:w="200"/>
+              <w:bottom w:type="dxa" w:w="120"/>
+              <w:right w:type="dxa" w:w="200"/>
+            </w:tcMar>
+          </w:tcPr>
+          <w:p>
+            <w:pPr>
+              <w:spacing w:after="80"/>
+            </w:pPr>
+            <w:r>
+              <w:rPr>
+                <w:rFonts w:ascii="Georgia" w:cs="Georgia" w:eastAsia="Georgia" w:hAnsi="Georgia"/>
+                <w:b/>
+                <w:bCs/>
+                <w:color w:val="2E86AB"/>
+                <w:sz w:val="22"/>
+                <w:szCs w:val="22"/>
+              </w:rPr>
+              <w:t xml:space="preserve">Convention Note: What JJᵀ Means Here</w:t>
+            </w:r>
+          </w:p>
+          <w:p>
+            <w:pPr>
+              <w:spacing w:after="160" w:line="300"/>
+            </w:pPr>
+            <w:r>
+              <w:rPr>
+                <w:rFonts w:ascii="Cambria" w:cs="Cambria" w:eastAsia="Cambria" w:hAnsi="Cambria"/>
+                <w:color w:val="333333"/>
+                <w:sz w:val="22"/>
+                <w:szCs w:val="22"/>
+              </w:rPr>
+              <w:t xml:space="preserve">The lecture notes write each ellipsoid as a </w:t>
+            </w:r>
+            <w:r>
+              <w:rPr>
+                <w:rFonts w:ascii="Cambria" w:cs="Cambria" w:eastAsia="Cambria" w:hAnsi="Cambria"/>
+                <w:b/>
+                <w:bCs/>
+                <w:color w:val="333333"/>
+                <w:sz w:val="22"/>
+                <w:szCs w:val="22"/>
+              </w:rPr>
+              <w:t xml:space="preserve">quadratic form</w:t>
+            </w:r>
+            <w:r>
+              <w:rPr>
+                <w:rFonts w:ascii="Cambria" w:cs="Cambria" w:eastAsia="Cambria" w:hAnsi="Cambria"/>
+                <w:color w:val="333333"/>
+                <w:sz w:val="22"/>
+                <w:szCs w:val="22"/>
+              </w:rPr>
+              <w:t xml:space="preserve">; this assignment (like Lab 01) builds its </w:t>
+            </w:r>
+            <w:r>
+              <w:rPr>
+                <w:rFonts w:ascii="Cambria" w:cs="Cambria" w:eastAsia="Cambria" w:hAnsi="Cambria"/>
+                <w:b/>
+                <w:bCs/>
+                <w:color w:val="333333"/>
+                <w:sz w:val="22"/>
+                <w:szCs w:val="22"/>
+              </w:rPr>
+              <w:t xml:space="preserve">shape matrix</w:t>
+            </w:r>
+            <w:r>
+              <w:rPr>
+                <w:rFonts w:ascii="Cambria" w:cs="Cambria" w:eastAsia="Cambria" w:hAnsi="Cambria"/>
+                <w:color w:val="333333"/>
+                <w:sz w:val="22"/>
+                <w:szCs w:val="22"/>
+              </w:rPr>
+              <w:t xml:space="preserve"> A, whose eigenvalue square roots are the semi-axis lengths (σᵢ). So A = JJᵀ here is the velocity (manipulability) ellipsoid — even though JJᵀ names the force ellipsoid’s quadratic form Fᵀ(JJᵀ)F ≤ 1 in the notes (§5.4). Same objects, different algebra. Everything in this assignment is the velocity ellipsoid.</w:t>
+            </w:r>
+          </w:p>
+        </w:tc>
+      </w:tr>
+    </w:tbl>
+    <w:p>
+      <w:pPr>
+        <w:spacing w:after="0"/>
+      </w:pPr>
     </w:p>
     <w:p>
       <w:pPr>
@@ -1186,7 +1072,7 @@
           <w:sz w:val="24"/>
           <w:szCs w:val="24"/>
         </w:rPr>
-        <w:t xml:space="preserve">Question 3.1 (10 pts)</w:t>
+        <w:t xml:space="preserve">Task 2.2 — Identify the Easy and Hard Directions (10 pts)</w:t>
       </w:r>
     </w:p>
     <w:p>
@@ -1200,27 +1086,97 @@
           <w:sz w:val="22"/>
           <w:szCs w:val="22"/>
         </w:rPr>
-        <w:t xml:space="preserve">Compare your two reaches across the following dimensions. For each, state which direction (easy or hard) has the larger value, and explain </w:t>
-      </w:r>
+        <w:t xml:space="preserve">The major axis of the ellipsoid is the direction in which the hand moves most easily; the minor axis is the hardest. </w:t>
+      </w:r>
+    </w:p>
+    <w:p>
+      <w:pPr>
+        <w:spacing w:after="160" w:line="300"/>
+      </w:pPr>
+      <w:r>
+        <w:rPr>
+          <w:rFonts w:ascii="Cambria" w:cs="Cambria" w:eastAsia="Cambria" w:hAnsi="Cambria"/>
+          <w:b/>
+          <w:bCs/>
+          <w:color w:val="333333"/>
+          <w:sz w:val="22"/>
+          <w:szCs w:val="22"/>
+        </w:rPr>
+        <w:t xml:space="preserve">You write 2 lines</w:t>
+      </w:r>
+      <w:r>
+        <w:rPr>
+          <w:rFonts w:ascii="Cambria" w:cs="Cambria" w:eastAsia="Cambria" w:hAnsi="Cambria"/>
+          <w:color w:val="333333"/>
+          <w:sz w:val="22"/>
+          <w:szCs w:val="22"/>
+        </w:rPr>
+        <w:t xml:space="preserve">: using the provided </w:t>
+      </w:r>
+      <w:r>
+        <w:rPr>
+          <w:rFonts w:ascii="Cambria Math" w:cs="Cambria Math" w:eastAsia="Cambria Math" w:hAnsi="Cambria Math"/>
+          <w:color w:val="333333"/>
+          <w:sz w:val="22"/>
+          <w:szCs w:val="22"/>
+        </w:rPr>
+        <w:t xml:space="preserve">closest_target(axis_angle, directions)</w:t>
+      </w:r>
+      <w:r>
+        <w:rPr>
+          <w:rFonts w:ascii="Cambria" w:cs="Cambria" w:eastAsia="Cambria" w:hAnsi="Cambria"/>
+          <w:color w:val="333333"/>
+          <w:sz w:val="22"/>
+          <w:szCs w:val="22"/>
+        </w:rPr>
+        <w:t xml:space="preserve"> helper, find which of the 8 targets is closest to the easy (major) axis and which is closest to the hard (minor) axis.</w:t>
+      </w:r>
+    </w:p>
+    <w:p>
+      <w:pPr>
+        <w:spacing w:after="160" w:line="300"/>
+      </w:pPr>
       <w:r>
         <w:rPr>
           <w:rFonts w:ascii="Cambria" w:cs="Cambria" w:eastAsia="Cambria" w:hAnsi="Cambria"/>
           <w:i/>
           <w:iCs/>
-          <w:color w:val="333333"/>
-          <w:sz w:val="22"/>
-          <w:szCs w:val="22"/>
-        </w:rPr>
-        <w:t xml:space="preserve">why</w:t>
-      </w:r>
-      <w:r>
-        <w:rPr>
-          <w:rFonts w:ascii="Cambria" w:cs="Cambria" w:eastAsia="Cambria" w:hAnsi="Cambria"/>
-          <w:color w:val="333333"/>
-          <w:sz w:val="22"/>
-          <w:szCs w:val="22"/>
-        </w:rPr>
-        <w:t xml:space="preserve"> in terms of the Jacobian and ellipsoid geometry:</w:t>
+          <w:color w:val="555555"/>
+          <w:sz w:val="22"/>
+          <w:szCs w:val="22"/>
+        </w:rPr>
+        <w:t xml:space="preserve">Provided in the notebook: </w:t>
+      </w:r>
+      <w:r>
+        <w:rPr>
+          <w:rFonts w:ascii="Cambria" w:cs="Cambria" w:eastAsia="Cambria" w:hAnsi="Cambria"/>
+          <w:i/>
+          <w:iCs/>
+          <w:color w:val="555555"/>
+          <w:sz w:val="22"/>
+          <w:szCs w:val="22"/>
+        </w:rPr>
+        <w:t xml:space="preserve">the principal-axis angles and the printout. The helper already accounts for the fact that directions 180° apart are equivalent for an ellipsoid axis.</w:t>
+      </w:r>
+    </w:p>
+    <w:p>
+      <w:pPr>
+        <w:pStyle w:val="Heading2"/>
+        <w:pBdr>
+          <w:bottom w:val="single" w:color="2E86AB" w:sz="1" w:space="4"/>
+        </w:pBdr>
+        <w:spacing w:after="160" w:before="300"/>
+      </w:pPr>
+      <w:r>
+        <w:rPr>
+          <w:rFonts w:ascii="Georgia" w:cs="Georgia" w:eastAsia="Georgia" w:hAnsi="Georgia"/>
+          <w:b/>
+          <w:bCs/>
+          <w:color w:val="2E86AB"/>
+          <w:sz w:val="24"/>
+          <w:szCs w:val="24"/>
+        </w:rPr>
+        <w:t xml:space="preserve">Question 2.1 (5 pts)</w:t>
       </w:r>
     </w:p>
     <w:p>
@@ -1230,77 +1186,11 @@
       <w:r>
         <w:rPr>
           <w:rFonts w:ascii="Cambria" w:cs="Cambria" w:eastAsia="Cambria" w:hAnsi="Cambria"/>
-          <w:b/>
-          <w:bCs/>
-          <w:color w:val="333333"/>
-          <w:sz w:val="22"/>
-          <w:szCs w:val="22"/>
-        </w:rPr>
-        <w:t xml:space="preserve">(a)</w:t>
-      </w:r>
-      <w:r>
-        <w:rPr>
-          <w:rFonts w:ascii="Cambria" w:cs="Cambria" w:eastAsia="Cambria" w:hAnsi="Cambria"/>
-          <w:color w:val="333333"/>
-          <w:sz w:val="22"/>
-          <w:szCs w:val="22"/>
-        </w:rPr>
-        <w:t xml:space="preserve"> Total joint excursion ‖Δq‖</w:t>
-      </w:r>
-    </w:p>
-    <w:p>
-      <w:pPr>
-        <w:spacing w:after="160" w:line="300"/>
-      </w:pPr>
-      <w:r>
-        <w:rPr>
-          <w:rFonts w:ascii="Cambria" w:cs="Cambria" w:eastAsia="Cambria" w:hAnsi="Cambria"/>
-          <w:b/>
-          <w:bCs/>
-          <w:color w:val="333333"/>
-          <w:sz w:val="22"/>
-          <w:szCs w:val="22"/>
-        </w:rPr>
-        <w:t xml:space="preserve">(b)</w:t>
-      </w:r>
-      <w:r>
-        <w:rPr>
-          <w:rFonts w:ascii="Cambria" w:cs="Cambria" w:eastAsia="Cambria" w:hAnsi="Cambria"/>
-          <w:color w:val="333333"/>
-          <w:sz w:val="22"/>
-          <w:szCs w:val="22"/>
-        </w:rPr>
-        <w:t xml:space="preserve"> Change in the Jacobian condition number from start to target</w:t>
-      </w:r>
-    </w:p>
-    <w:p>
-      <w:pPr>
-        <w:spacing w:after="160" w:line="300"/>
-      </w:pPr>
-      <w:r>
-        <w:rPr>
-          <w:rFonts w:ascii="Cambria" w:cs="Cambria" w:eastAsia="Cambria" w:hAnsi="Cambria"/>
-          <w:b/>
-          <w:bCs/>
-          <w:color w:val="333333"/>
-          <w:sz w:val="22"/>
-          <w:szCs w:val="22"/>
-        </w:rPr>
-        <w:t xml:space="preserve">(c)</w:t>
-      </w:r>
-      <w:r>
-        <w:rPr>
-          <w:rFonts w:ascii="Cambria" w:cs="Cambria" w:eastAsia="Cambria" w:hAnsi="Cambria"/>
-          <w:color w:val="333333"/>
-          <w:sz w:val="22"/>
-          <w:szCs w:val="22"/>
-        </w:rPr>
-        <w:t xml:space="preserve"> If movement duration is proportional to joint excursion (a simplification), which reach would be faster? Is this consistent with experimental findings that reaching performance varies with direction?</w:t>
-      </w:r>
-    </w:p>
-    <w:p>
-      <w:r>
-        <w:br w:type="page"/>
+          <w:color w:val="333333"/>
+          <w:sz w:val="22"/>
+          <w:szCs w:val="22"/>
+        </w:rPr>
+        <w:t xml:space="preserve">In your own words, explain what the manipulability ellipsoid tells us about reaching in the easy vs. hard direction. What specific kinematic quantity is larger/smaller in each direction?</w:t>
       </w:r>
     </w:p>
     <w:p>
@@ -1317,7 +1207,580 @@
           <w:sz w:val="30"/>
           <w:szCs w:val="30"/>
         </w:rPr>
+        <w:t xml:space="preserve">Part 3: Detailed Predictions for Two Reach Directions (35 pts)</w:t>
+      </w:r>
+    </w:p>
+    <w:p>
+      <w:pPr>
+        <w:pBdr>
+          <w:left w:val="single" w:sz="12" w:space="6" w:color="2E86AB"/>
+        </w:pBdr>
+        <w:spacing w:after="160" w:line="280"/>
+        <w:ind w:left="140"/>
+      </w:pPr>
+      <w:r>
+        <w:rPr>
+          <w:rFonts w:ascii="Georgia" w:cs="Georgia" w:eastAsia="Georgia" w:hAnsi="Georgia"/>
+          <w:b/>
+          <w:bCs/>
+          <w:color w:val="2E86AB"/>
+          <w:sz w:val="19"/>
+          <w:szCs w:val="19"/>
+        </w:rPr>
+        <w:t xml:space="preserve">Lecture notes: </w:t>
+      </w:r>
+      <w:r>
+        <w:rPr>
+          <w:rFonts w:ascii="Cambria" w:cs="Cambria" w:eastAsia="Cambria" w:hAnsi="Cambria"/>
+          <w:i/>
+          <w:iCs/>
+          <w:color w:val="555555"/>
+          <w:sz w:val="19"/>
+          <w:szCs w:val="19"/>
+        </w:rPr>
+        <w:t xml:space="preserve">§3 Inverse Kinematics — Eqs. 3.1–3.8, solved at each target in Task 3.1. §4.3 The Jacobian as a Velocity Transformer — Eqs. 4.6–4.7 explain why the same 10 cm hand displacement costs different joint excursions. §4.2 The Determinant and Singularities — Eqs. 4.4–4.5; the condition number rises as θ₂ → 0. §5.2 Eigenvalue Analysis for reading the ellipsoid change from start to target.</w:t>
+      </w:r>
+    </w:p>
+    <w:p>
+      <w:pPr>
+        <w:spacing w:after="160" w:line="300"/>
+      </w:pPr>
+      <w:r>
+        <w:rPr>
+          <w:rFonts w:ascii="Cambria" w:cs="Cambria" w:eastAsia="Cambria" w:hAnsi="Cambria"/>
+          <w:color w:val="333333"/>
+          <w:sz w:val="22"/>
+          <w:szCs w:val="22"/>
+        </w:rPr>
+        <w:t xml:space="preserve">Now analyze your two selected reaches in detail: one toward the </w:t>
+      </w:r>
+      <w:r>
+        <w:rPr>
+          <w:rFonts w:ascii="Cambria" w:cs="Cambria" w:eastAsia="Cambria" w:hAnsi="Cambria"/>
+          <w:b/>
+          <w:bCs/>
+          <w:color w:val="333333"/>
+          <w:sz w:val="22"/>
+          <w:szCs w:val="22"/>
+        </w:rPr>
+        <w:t xml:space="preserve">easy target</w:t>
+      </w:r>
+      <w:r>
+        <w:rPr>
+          <w:rFonts w:ascii="Cambria" w:cs="Cambria" w:eastAsia="Cambria" w:hAnsi="Cambria"/>
+          <w:color w:val="333333"/>
+          <w:sz w:val="22"/>
+          <w:szCs w:val="22"/>
+        </w:rPr>
+        <w:t xml:space="preserve"> and one toward the </w:t>
+      </w:r>
+      <w:r>
+        <w:rPr>
+          <w:rFonts w:ascii="Cambria" w:cs="Cambria" w:eastAsia="Cambria" w:hAnsi="Cambria"/>
+          <w:b/>
+          <w:bCs/>
+          <w:color w:val="333333"/>
+          <w:sz w:val="22"/>
+          <w:szCs w:val="22"/>
+        </w:rPr>
+        <w:t xml:space="preserve">hard target</w:t>
+      </w:r>
+      <w:r>
+        <w:rPr>
+          <w:rFonts w:ascii="Cambria" w:cs="Cambria" w:eastAsia="Cambria" w:hAnsi="Cambria"/>
+          <w:color w:val="333333"/>
+          <w:sz w:val="22"/>
+          <w:szCs w:val="22"/>
+        </w:rPr>
+        <w:t xml:space="preserve">.</w:t>
+      </w:r>
+    </w:p>
+    <w:p>
+      <w:pPr>
+        <w:pStyle w:val="Heading2"/>
+        <w:pBdr>
+          <w:bottom w:val="single" w:color="2E86AB" w:sz="1" w:space="4"/>
+        </w:pBdr>
+        <w:spacing w:after="160" w:before="300"/>
+      </w:pPr>
+      <w:r>
+        <w:rPr>
+          <w:rFonts w:ascii="Georgia" w:cs="Georgia" w:eastAsia="Georgia" w:hAnsi="Georgia"/>
+          <w:b/>
+          <w:bCs/>
+          <w:color w:val="2E86AB"/>
+          <w:sz w:val="24"/>
+          <w:szCs w:val="24"/>
+        </w:rPr>
+        <w:t xml:space="preserve">Task 3.1 — Compute Joint-Level Requirements (15 pts)</w:t>
+      </w:r>
+    </w:p>
+    <w:p>
+      <w:pPr>
+        <w:spacing w:after="160" w:line="300"/>
+      </w:pPr>
+      <w:r>
+        <w:rPr>
+          <w:rFonts w:ascii="Cambria" w:cs="Cambria" w:eastAsia="Cambria" w:hAnsi="Cambria"/>
+          <w:color w:val="333333"/>
+          <w:sz w:val="22"/>
+          <w:szCs w:val="22"/>
+        </w:rPr>
+        <w:t xml:space="preserve">Inside the provided loop (which solves IK for each target), </w:t>
+      </w:r>
+      <w:r>
+        <w:rPr>
+          <w:rFonts w:ascii="Cambria" w:cs="Cambria" w:eastAsia="Cambria" w:hAnsi="Cambria"/>
+          <w:b/>
+          <w:bCs/>
+          <w:color w:val="333333"/>
+          <w:sz w:val="22"/>
+          <w:szCs w:val="22"/>
+        </w:rPr>
+        <w:t xml:space="preserve">you write 2 lines</w:t>
+      </w:r>
+      <w:r>
+        <w:rPr>
+          <w:rFonts w:ascii="Cambria" w:cs="Cambria" w:eastAsia="Cambria" w:hAnsi="Cambria"/>
+          <w:color w:val="333333"/>
+          <w:sz w:val="22"/>
+          <w:szCs w:val="22"/>
+        </w:rPr>
+        <w:t xml:space="preserve">:</w:t>
+      </w:r>
+    </w:p>
+    <w:p>
+      <w:pPr>
+        <w:pStyle w:val="ListParagraph"/>
+        <w:numPr>
+          <w:ilvl w:val="0"/>
+          <w:numId w:val="3"/>
+        </w:numPr>
+        <w:spacing w:after="100" w:line="300"/>
+      </w:pPr>
+      <w:r>
+        <w:rPr>
+          <w:rFonts w:ascii="Cambria" w:cs="Cambria" w:eastAsia="Cambria" w:hAnsi="Cambria"/>
+          <w:color w:val="333333"/>
+          <w:sz w:val="22"/>
+          <w:szCs w:val="22"/>
+        </w:rPr>
+        <w:t xml:space="preserve">the joint displacement Δq = q_target − q_start</w:t>
+      </w:r>
+    </w:p>
+    <w:p>
+      <w:pPr>
+        <w:pStyle w:val="ListParagraph"/>
+        <w:numPr>
+          <w:ilvl w:val="0"/>
+          <w:numId w:val="3"/>
+        </w:numPr>
+        <w:spacing w:after="100" w:line="300"/>
+      </w:pPr>
+      <w:r>
+        <w:rPr>
+          <w:rFonts w:ascii="Cambria" w:cs="Cambria" w:eastAsia="Cambria" w:hAnsi="Cambria"/>
+          <w:color w:val="333333"/>
+          <w:sz w:val="22"/>
+          <w:szCs w:val="22"/>
+        </w:rPr>
+        <w:t xml:space="preserve">its magnitude ‖Δq‖ (the total joint excursion, in radians)</w:t>
+      </w:r>
+    </w:p>
+    <w:p>
+      <w:pPr>
+        <w:spacing w:after="160" w:line="300"/>
+      </w:pPr>
+      <w:r>
+        <w:rPr>
+          <w:rFonts w:ascii="Cambria" w:cs="Cambria" w:eastAsia="Cambria" w:hAnsi="Cambria"/>
+          <w:i/>
+          <w:iCs/>
+          <w:color w:val="555555"/>
+          <w:sz w:val="22"/>
+          <w:szCs w:val="22"/>
+        </w:rPr>
+        <w:t xml:space="preserve">Provided in the notebook: </w:t>
+      </w:r>
+      <w:r>
+        <w:rPr>
+          <w:rFonts w:ascii="Cambria" w:cs="Cambria" w:eastAsia="Cambria" w:hAnsi="Cambria"/>
+          <w:i/>
+          <w:iCs/>
+          <w:color w:val="555555"/>
+          <w:sz w:val="22"/>
+          <w:szCs w:val="22"/>
+        </w:rPr>
+        <w:t xml:space="preserve">the IK call, the target-posture Jacobian condition number via the condition_number helper, and the comparison table.</w:t>
+      </w:r>
+    </w:p>
+    <w:p>
+      <w:pPr>
+        <w:pStyle w:val="Heading2"/>
+        <w:pBdr>
+          <w:bottom w:val="single" w:color="2E86AB" w:sz="1" w:space="4"/>
+        </w:pBdr>
+        <w:spacing w:after="160" w:before="300"/>
+      </w:pPr>
+      <w:r>
+        <w:rPr>
+          <w:rFonts w:ascii="Georgia" w:cs="Georgia" w:eastAsia="Georgia" w:hAnsi="Georgia"/>
+          <w:b/>
+          <w:bCs/>
+          <w:color w:val="2E86AB"/>
+          <w:sz w:val="24"/>
+          <w:szCs w:val="24"/>
+        </w:rPr>
+        <w:t xml:space="preserve">Task 3.2 — Visualize Both Reaches (10 pts)</w:t>
+      </w:r>
+    </w:p>
+    <w:p>
+      <w:pPr>
+        <w:spacing w:after="160" w:line="300"/>
+      </w:pPr>
+      <w:r>
+        <w:rPr>
+          <w:rFonts w:ascii="Cambria" w:cs="Cambria" w:eastAsia="Cambria" w:hAnsi="Cambria"/>
+          <w:color w:val="333333"/>
+          <w:sz w:val="22"/>
+          <w:szCs w:val="22"/>
+        </w:rPr>
+        <w:t xml:space="preserve">The notebook builds the </w:t>
+      </w:r>
+      <w:r>
+        <w:rPr>
+          <w:rFonts w:ascii="Cambria" w:cs="Cambria" w:eastAsia="Cambria" w:hAnsi="Cambria"/>
+          <w:b/>
+          <w:bCs/>
+          <w:color w:val="333333"/>
+          <w:sz w:val="22"/>
+          <w:szCs w:val="22"/>
+        </w:rPr>
+        <w:t xml:space="preserve">two-panel figure</w:t>
+      </w:r>
+      <w:r>
+        <w:rPr>
+          <w:rFonts w:ascii="Cambria" w:cs="Cambria" w:eastAsia="Cambria" w:hAnsi="Cambria"/>
+          <w:color w:val="333333"/>
+          <w:sz w:val="22"/>
+          <w:szCs w:val="22"/>
+        </w:rPr>
+        <w:t xml:space="preserve"> (easy reach | hard reach), drawing the start posture, the hand path, and the panel titles for you. </w:t>
+      </w:r>
+      <w:r>
+        <w:rPr>
+          <w:rFonts w:ascii="Cambria" w:cs="Cambria" w:eastAsia="Cambria" w:hAnsi="Cambria"/>
+          <w:b/>
+          <w:bCs/>
+          <w:color w:val="333333"/>
+          <w:sz w:val="22"/>
+          <w:szCs w:val="22"/>
+        </w:rPr>
+        <w:t xml:space="preserve">You write 2 lines</w:t>
+      </w:r>
+      <w:r>
+        <w:rPr>
+          <w:rFonts w:ascii="Cambria" w:cs="Cambria" w:eastAsia="Cambria" w:hAnsi="Cambria"/>
+          <w:color w:val="333333"/>
+          <w:sz w:val="22"/>
+          <w:szCs w:val="22"/>
+        </w:rPr>
+        <w:t xml:space="preserve">: inside the loop, draw the arm at the </w:t>
+      </w:r>
+      <w:r>
+        <w:rPr>
+          <w:rFonts w:ascii="Cambria" w:cs="Cambria" w:eastAsia="Cambria" w:hAnsi="Cambria"/>
+          <w:b/>
+          <w:bCs/>
+          <w:color w:val="333333"/>
+          <w:sz w:val="22"/>
+          <w:szCs w:val="22"/>
+        </w:rPr>
+        <w:t xml:space="preserve">target</w:t>
+      </w:r>
+      <w:r>
+        <w:rPr>
+          <w:rFonts w:ascii="Cambria" w:cs="Cambria" w:eastAsia="Cambria" w:hAnsi="Cambria"/>
+          <w:color w:val="333333"/>
+          <w:sz w:val="22"/>
+          <w:szCs w:val="22"/>
+        </w:rPr>
+        <w:t xml:space="preserve"> posture and its manipulability ellipsoid, using </w:t>
+      </w:r>
+      <w:r>
+        <w:rPr>
+          <w:rFonts w:ascii="Cambria Math" w:cs="Cambria Math" w:eastAsia="Cambria Math" w:hAnsi="Cambria Math"/>
+          <w:color w:val="333333"/>
+          <w:sz w:val="22"/>
+          <w:szCs w:val="22"/>
+        </w:rPr>
+        <w:t xml:space="preserve">data['q_target']</w:t>
+      </w:r>
+      <w:r>
+        <w:rPr>
+          <w:rFonts w:ascii="Cambria" w:cs="Cambria" w:eastAsia="Cambria" w:hAnsi="Cambria"/>
+          <w:color w:val="333333"/>
+          <w:sz w:val="22"/>
+          <w:szCs w:val="22"/>
+        </w:rPr>
+        <w:t xml:space="preserve"> with the </w:t>
+      </w:r>
+      <w:r>
+        <w:rPr>
+          <w:rFonts w:ascii="Cambria Math" w:cs="Cambria Math" w:eastAsia="Cambria Math" w:hAnsi="Cambria Math"/>
+          <w:color w:val="333333"/>
+          <w:sz w:val="22"/>
+          <w:szCs w:val="22"/>
+        </w:rPr>
+        <w:t xml:space="preserve">draw_arm</w:t>
+      </w:r>
+      <w:r>
+        <w:rPr>
+          <w:rFonts w:ascii="Cambria" w:cs="Cambria" w:eastAsia="Cambria" w:hAnsi="Cambria"/>
+          <w:color w:val="333333"/>
+          <w:sz w:val="22"/>
+          <w:szCs w:val="22"/>
+        </w:rPr>
+        <w:t xml:space="preserve"> and </w:t>
+      </w:r>
+      <w:r>
+        <w:rPr>
+          <w:rFonts w:ascii="Cambria Math" w:cs="Cambria Math" w:eastAsia="Cambria Math" w:hAnsi="Cambria Math"/>
+          <w:color w:val="333333"/>
+          <w:sz w:val="22"/>
+          <w:szCs w:val="22"/>
+        </w:rPr>
+        <w:t xml:space="preserve">draw_manip_ellipsoid</w:t>
+      </w:r>
+      <w:r>
+        <w:rPr>
+          <w:rFonts w:ascii="Cambria" w:cs="Cambria" w:eastAsia="Cambria" w:hAnsi="Cambria"/>
+          <w:color w:val="333333"/>
+          <w:sz w:val="22"/>
+          <w:szCs w:val="22"/>
+        </w:rPr>
+        <w:t xml:space="preserve"> helpers.</w:t>
+      </w:r>
+    </w:p>
+    <w:p>
+      <w:pPr>
+        <w:spacing w:after="160" w:line="300"/>
+      </w:pPr>
+      <w:r>
+        <w:rPr>
+          <w:rFonts w:ascii="Cambria" w:cs="Cambria" w:eastAsia="Cambria" w:hAnsi="Cambria"/>
+          <w:color w:val="333333"/>
+          <w:sz w:val="22"/>
+          <w:szCs w:val="22"/>
+        </w:rPr>
+        <w:t xml:space="preserve">Each panel then shows the start posture (light) and the target posture (bold), the manipulability ellipsoid at both, and a title giving the target direction and total joint excursion. This two-panel figure is </w:t>
+      </w:r>
+    </w:p>
+    <w:p>
+      <w:pPr>
+        <w:spacing w:after="160" w:line="300"/>
+      </w:pPr>
+      <w:r>
+        <w:rPr>
+          <w:rFonts w:ascii="Cambria" w:cs="Cambria" w:eastAsia="Cambria" w:hAnsi="Cambria"/>
+          <w:b/>
+          <w:bCs/>
+          <w:color w:val="333333"/>
+          <w:sz w:val="22"/>
+          <w:szCs w:val="22"/>
+        </w:rPr>
+        <w:t xml:space="preserve">Figure 1</w:t>
+      </w:r>
+      <w:r>
+        <w:rPr>
+          <w:rFonts w:ascii="Cambria" w:cs="Cambria" w:eastAsia="Cambria" w:hAnsi="Cambria"/>
+          <w:color w:val="333333"/>
+          <w:sz w:val="22"/>
+          <w:szCs w:val="22"/>
+        </w:rPr>
+        <w:t xml:space="preserve"> for your write-up in Part 4.</w:t>
+      </w:r>
+    </w:p>
+    <w:p>
+      <w:pPr>
+        <w:pStyle w:val="Heading2"/>
+        <w:pBdr>
+          <w:bottom w:val="single" w:color="2E86AB" w:sz="1" w:space="4"/>
+        </w:pBdr>
+        <w:spacing w:after="160" w:before="300"/>
+      </w:pPr>
+      <w:r>
+        <w:rPr>
+          <w:rFonts w:ascii="Georgia" w:cs="Georgia" w:eastAsia="Georgia" w:hAnsi="Georgia"/>
+          <w:b/>
+          <w:bCs/>
+          <w:color w:val="2E86AB"/>
+          <w:sz w:val="24"/>
+          <w:szCs w:val="24"/>
+        </w:rPr>
+        <w:t xml:space="preserve">Question 3.1 (10 pts)</w:t>
+      </w:r>
+    </w:p>
+    <w:p>
+      <w:pPr>
+        <w:spacing w:after="160" w:line="300"/>
+      </w:pPr>
+      <w:r>
+        <w:rPr>
+          <w:rFonts w:ascii="Cambria" w:cs="Cambria" w:eastAsia="Cambria" w:hAnsi="Cambria"/>
+          <w:color w:val="333333"/>
+          <w:sz w:val="22"/>
+          <w:szCs w:val="22"/>
+        </w:rPr>
+        <w:t xml:space="preserve">Compare your two reaches across the following dimensions. For each, state which direction (easy or hard) has the larger value, and explain </w:t>
+      </w:r>
+      <w:r>
+        <w:rPr>
+          <w:rFonts w:ascii="Cambria" w:cs="Cambria" w:eastAsia="Cambria" w:hAnsi="Cambria"/>
+          <w:i/>
+          <w:iCs/>
+          <w:color w:val="333333"/>
+          <w:sz w:val="22"/>
+          <w:szCs w:val="22"/>
+        </w:rPr>
+        <w:t xml:space="preserve">why</w:t>
+      </w:r>
+      <w:r>
+        <w:rPr>
+          <w:rFonts w:ascii="Cambria" w:cs="Cambria" w:eastAsia="Cambria" w:hAnsi="Cambria"/>
+          <w:color w:val="333333"/>
+          <w:sz w:val="22"/>
+          <w:szCs w:val="22"/>
+        </w:rPr>
+        <w:t xml:space="preserve"> in terms of the Jacobian and ellipsoid geometry:</w:t>
+      </w:r>
+    </w:p>
+    <w:p>
+      <w:pPr>
+        <w:spacing w:after="160" w:line="300"/>
+      </w:pPr>
+      <w:r>
+        <w:rPr>
+          <w:rFonts w:ascii="Cambria" w:cs="Cambria" w:eastAsia="Cambria" w:hAnsi="Cambria"/>
+          <w:b/>
+          <w:bCs/>
+          <w:color w:val="333333"/>
+          <w:sz w:val="22"/>
+          <w:szCs w:val="22"/>
+        </w:rPr>
+        <w:t xml:space="preserve">(a)</w:t>
+      </w:r>
+      <w:r>
+        <w:rPr>
+          <w:rFonts w:ascii="Cambria" w:cs="Cambria" w:eastAsia="Cambria" w:hAnsi="Cambria"/>
+          <w:color w:val="333333"/>
+          <w:sz w:val="22"/>
+          <w:szCs w:val="22"/>
+        </w:rPr>
+        <w:t xml:space="preserve"> Total joint excursion ‖Δq‖</w:t>
+      </w:r>
+    </w:p>
+    <w:p>
+      <w:pPr>
+        <w:spacing w:after="160" w:line="300"/>
+      </w:pPr>
+      <w:r>
+        <w:rPr>
+          <w:rFonts w:ascii="Cambria" w:cs="Cambria" w:eastAsia="Cambria" w:hAnsi="Cambria"/>
+          <w:b/>
+          <w:bCs/>
+          <w:color w:val="333333"/>
+          <w:sz w:val="22"/>
+          <w:szCs w:val="22"/>
+        </w:rPr>
+        <w:t xml:space="preserve">(b)</w:t>
+      </w:r>
+      <w:r>
+        <w:rPr>
+          <w:rFonts w:ascii="Cambria" w:cs="Cambria" w:eastAsia="Cambria" w:hAnsi="Cambria"/>
+          <w:color w:val="333333"/>
+          <w:sz w:val="22"/>
+          <w:szCs w:val="22"/>
+        </w:rPr>
+        <w:t xml:space="preserve"> Change in the Jacobian condition number from start to target</w:t>
+      </w:r>
+    </w:p>
+    <w:p>
+      <w:pPr>
+        <w:spacing w:after="160" w:line="300"/>
+      </w:pPr>
+      <w:r>
+        <w:rPr>
+          <w:rFonts w:ascii="Cambria" w:cs="Cambria" w:eastAsia="Cambria" w:hAnsi="Cambria"/>
+          <w:b/>
+          <w:bCs/>
+          <w:color w:val="333333"/>
+          <w:sz w:val="22"/>
+          <w:szCs w:val="22"/>
+        </w:rPr>
+        <w:t xml:space="preserve">(c)</w:t>
+      </w:r>
+      <w:r>
+        <w:rPr>
+          <w:rFonts w:ascii="Cambria" w:cs="Cambria" w:eastAsia="Cambria" w:hAnsi="Cambria"/>
+          <w:color w:val="333333"/>
+          <w:sz w:val="22"/>
+          <w:szCs w:val="22"/>
+        </w:rPr>
+        <w:t xml:space="preserve"> If movement duration is proportional to joint excursion (a simplification), which reach would be faster? Is this consistent with experimental findings that reaching performance varies with direction?</w:t>
+      </w:r>
+    </w:p>
+    <w:p>
+      <w:r>
+        <w:br w:type="page"/>
+      </w:r>
+    </w:p>
+    <w:p>
+      <w:pPr>
+        <w:pStyle w:val="Heading1"/>
+        <w:spacing w:after="200" w:before="360"/>
+      </w:pPr>
+      <w:r>
+        <w:rPr>
+          <w:rFonts w:ascii="Georgia" w:cs="Georgia" w:eastAsia="Georgia" w:hAnsi="Georgia"/>
+          <w:b/>
+          <w:bCs/>
+          <w:color w:val="1B2A4A"/>
+          <w:sz w:val="30"/>
+          <w:szCs w:val="30"/>
+        </w:rPr>
         <w:t xml:space="preserve">Part 4: Methods &amp; Predictions Write-Up (20 pts)</w:t>
+      </w:r>
+    </w:p>
+    <w:p>
+      <w:pPr>
+        <w:pBdr>
+          <w:left w:val="single" w:sz="12" w:space="6" w:color="2E86AB"/>
+        </w:pBdr>
+        <w:spacing w:after="160" w:line="280"/>
+        <w:ind w:left="140"/>
+      </w:pPr>
+      <w:r>
+        <w:rPr>
+          <w:rFonts w:ascii="Georgia" w:cs="Georgia" w:eastAsia="Georgia" w:hAnsi="Georgia"/>
+          <w:b/>
+          <w:bCs/>
+          <w:color w:val="2E86AB"/>
+          <w:sz w:val="19"/>
+          <w:szCs w:val="19"/>
+        </w:rPr>
+        <w:t xml:space="preserve">Lecture notes: </w:t>
+      </w:r>
+      <w:r>
+        <w:rPr>
+          <w:rFonts w:ascii="Cambria" w:cs="Cambria" w:eastAsia="Cambria" w:hAnsi="Cambria"/>
+          <w:i/>
+          <w:iCs/>
+          <w:color w:val="555555"/>
+          <w:sz w:val="19"/>
+          <w:szCs w:val="19"/>
+        </w:rPr>
+        <w:t xml:space="preserve">§7 Summary of Key Results — every equation you will cite, in one place. §6.3 Preview: Why This Matters — useful framing for the Predictions paragraph. Required reading: Gribble et al. (1998) for the arm model; Morasso (1981) for the reaching literature your predictions speak to.</w:t>
       </w:r>
     </w:p>
     <w:p>
@@ -1729,7 +2192,7 @@
                 <w:sz w:val="20"/>
                 <w:szCs w:val="20"/>
               </w:rPr>
-              <w:t xml:space="preserve">Part 2: Manipulability Analysis</w:t>
+              <w:t xml:space="preserve">Part 2: Manipulability Analysis at the Start Posture</w:t>
             </w:r>
           </w:p>
         </w:tc>
@@ -1794,7 +2257,7 @@
                 <w:sz w:val="20"/>
                 <w:szCs w:val="20"/>
               </w:rPr>
-              <w:t xml:space="preserve">Part 3: Predictions for Two Reaches</w:t>
+              <w:t xml:space="preserve">Part 3: Detailed Predictions for Two Reach Directions</w:t>
             </w:r>
           </w:p>
         </w:tc>

</xml_diff>